<commit_message>
[REPO] Route GitHub CI by affected product contracts
</commit_message>
<xml_diff>
--- a/BATCH_LOG.docx
+++ b/BATCH_LOG.docx
@@ -8708,6 +8708,29 @@
     <w:p>
       <w:r>
         <w:t>Cleanup362 final seal is C:\Users\jleyv\Peanut Butter\AI Assisted Software Engineering Mass Repository\Projects\.worktrees\mousecat-development-continuity\.mousecat\asset-library-connect-20261009\transport-cleanup362-20261009\final-receipt.json SHA-256 4094b29a51adcd2f78dc9f5ec4840ed46aeaafc244389827ed2a85dacb525093. The measured after-deletion restoration, 104-file preservation and source/Git proofs retain their exact observation intervals. A console-only ordered-dictionary display defect was corrected against the valid durable receipt; deletion was not replayed.</w:t>
+      </w:r>
+    </w:p>
+    <w:p>
+      <w:pPr>
+        <w:pStyle w:val="Heading3"/>
+      </w:pPr>
+      <w:r>
+        <w:t>2026-10-09 23:31 UTC / 16:31 PST — D2 publication and independent CI routing</w:t>
+      </w:r>
+    </w:p>
+    <w:p>
+      <w:r>
+        <w:t>[D2] Leisure is CLOSED and published. Self-merged PR139 (https://github.com/ellyj3rain/sao/pull/139) delivered version 3.8.1.0-pre-alpha at commit 7144849d0efa3906d2cd60c319806958e69e3544 on 2026-10-09 at 23:20 UTC. The coherent leisure product, its native implementations, applicable simulations and focused causal results are recorded in D2's record (Batches/D2-20261005-2341Z-1641PST-leisure.md). The operator's correction makes ordinary aggregate play and recovered feedback the basis for ongoing assessment; it does not assign a loaded-game or exhaustive one-to-one verification chore. Later product improvements link back to D2. Publication and its actual squash merge were independently restored before retiring the publisher. The source resumed D3 construction/crafting/repair/utilities with 37 peer indexes and source working files preserved.</w:t>
+      </w:r>
+    </w:p>
+    <w:p>
+      <w:r>
+        <w:t>[REPO] Affected-contract GitHub CI. This independently owned maintenance change uses the existing standing check registry and imported checker inputs to select from the complete PR base-to-head diff. Required ci-verify covers affected product, source/package and executable routing contracts. A directly affected failing result refuses the merge. Shared native interfaces and unresolved production dependencies expand product checks. Required codeql-python always reports and analyzes changed Python/security inputs. No workflow path filter leaves required contexts pending. The distinct maintenance advisory job preserves actual failing outcomes and logs. Historical graph/catalogue/absence censuses and the complete standing suite run through explicit or scheduled advisory maintenance. Main publication does not repeat the whole suite.</w:t>
+      </w:r>
+    </w:p>
+    <w:p>
+      <w:r>
+        <w:t>Focused controls exercise documentation, imported tool dependencies, deleted helpers, native/shared/unknown inputs, security changes, real affected failure, an unrelated advisory finding, and a later documentation commit retaining the earlier full PR diff. Qualified source adaptations use exact file/source ownership and occurrence pins in the existing repetition scanner; new authored copying and changed pins still fail its controls. The sealed native registry remains byte-exact. This work changes no production runtime, installed mod, save, normal play flow or product version credit. Exact selection, remote job results, branch-policy readback and archive/recenter receipts live under _scratch/d2-finish-20261009/dynamic-ci-publication/.</w:t>
       </w:r>
     </w:p>
     <w:sectPr>

</xml_diff>